<commit_message>
add chat rag engine fixes
</commit_message>
<xml_diff>
--- a/rag/rag_knowledge_base_v2.docx
+++ b/rag/rag_knowledge_base_v2.docx
@@ -7868,7 +7868,17 @@
           <w:sz w:val="20"/>
           <w:szCs w:val="20"/>
         </w:rPr>
-        <w:t xml:space="preserve">⚠️  Ne JAMAIS suggérer de relancer le solveur si le statut est OPTIMAL — c'est une preuve mathématique, pas une limite de temps.</w:t>
+        <w:t>⚠️  Si le statut est OPTIMAL :</w:t>
+        <w:br/>
+        <w:t>— Ne pas suggérer simplement de relancer le solveur avec plus de temps (l'objectif modélisé est déjà prouvé optimal).</w:t>
+        <w:br/>
+        <w:t>— MAIS continuer à analyser les améliorations industrielles possibles hors du modèle mathématique actuel.</w:t>
+        <w:br/>
+        <w:t>— Proposer des améliorations opérationnelles réelles à partir des données SQL disponibles.</w:t>
+        <w:br/>
+        <w:t>— Le statut OPTIMAL ne signifie PAS que le planning réel ne peut plus être amélioré sur les KPIs industriels.</w:t>
+        <w:br/>
+        <w:t xml:space="preserve">  Si le statut est FEASIBLE : relancer avec plus de temps ET appliquer les améliorations industrielles.</w:t>
       </w:r>
     </w:p>
     <w:p>
@@ -8108,7 +8118,7 @@
           <w:sz w:val="22"/>
           <w:szCs w:val="22"/>
         </w:rPr>
-        <w:t xml:space="preserve">Statut CP-SAT = OPTIMAL (preuve mathématique d'optimalité)</w:t>
+        <w:t>Statut CP-SAT = OPTIMAL (optimalité mathématique pour l'objectif retard+makespan — des améliorations industrielles restent possibles sur d'autres KPIs)</w:t>
       </w:r>
     </w:p>
     <w:p>
@@ -9958,7 +9968,7 @@
           <w:sz w:val="22"/>
           <w:szCs w:val="22"/>
         </w:rPr>
-        <w:t xml:space="preserve">Si le statut est OPTIMAL, ne JAMAIS suggérer de relancer le solveur — l'optimalité est prouvée.</w:t>
+        <w:t>Si le statut est OPTIMAL : ne pas suggérer simplement de relancer le solveur — MAIS analyser systématiquement les améliorations industrielles depuis les données SQL (rééquilibrage machine, réduction des lots, parallélisation, séquencement). Répondre uniquement « aucune amélioration possible » est INTERDIT.</w:t>
       </w:r>
     </w:p>
     <w:p>
@@ -12102,6 +12112,463 @@
       <w:pPr>
         <w:spacing w:after="200"/>
       </w:pPr>
+    </w:p>
+    <w:p>
+      <w:pPr>
+        <w:pStyle w:val="Heading1"/>
+      </w:pPr>
+      <w:r>
+        <w:t>PARTIE IX — Raisonnement Industriel Avancé et Analyse Post-OPTIMAL</w:t>
+      </w:r>
+    </w:p>
+    <w:p>
+      <w:r>
+        <w:t>Cette partie définit comment l'assistant doit raisonner lorsqu'un planning a le statut OPTIMAL. L'objectif est de transformer l'assistant d'un 'validateur CP-SAT' en un véritable 'consultant en optimisation industrielle utilisant les données du planning'.</w:t>
+      </w:r>
+    </w:p>
+    <w:p>
+      <w:pPr>
+        <w:pStyle w:val="Heading2"/>
+      </w:pPr>
+      <w:r>
+        <w:t>1. Distinction fondamentale : Optimalité mathématique vs Optimalité industrielle</w:t>
+      </w:r>
+    </w:p>
+    <w:p>
+      <w:r>
+        <w:t>Le statut OPTIMAL signifie uniquement : 'optimal pour le MODÈLE MATHÉMATIQUE ACTUEL et ses contraintes.'</w:t>
+      </w:r>
+    </w:p>
+    <w:p>
+      <w:r>
+        <w:t>Il ne signifie PAS :</w:t>
+      </w:r>
+    </w:p>
+    <w:p>
+      <w:pPr>
+        <w:pStyle w:val="ListParagraph"/>
+      </w:pPr>
+      <w:r>
+        <w:t>❌  meilleur planning industriel possible dans la réalité</w:t>
+      </w:r>
+    </w:p>
+    <w:p>
+      <w:pPr>
+        <w:pStyle w:val="ListParagraph"/>
+      </w:pPr>
+      <w:r>
+        <w:t>❌  impossible de réduire les retards par des actions opérationnelles</w:t>
+      </w:r>
+    </w:p>
+    <w:p>
+      <w:pPr>
+        <w:pStyle w:val="ListParagraph"/>
+      </w:pPr>
+      <w:r>
+        <w:t>❌  impossible de réduire le makespan par des changements de ressources</w:t>
+      </w:r>
+    </w:p>
+    <w:p>
+      <w:pPr>
+        <w:pStyle w:val="ListParagraph"/>
+      </w:pPr>
+      <w:r>
+        <w:t>❌  impossible de rééquilibrer les machines</w:t>
+      </w:r>
+    </w:p>
+    <w:p>
+      <w:pPr>
+        <w:pStyle w:val="ListParagraph"/>
+      </w:pPr>
+      <w:r>
+        <w:t>❌  impossible d'améliorer le batching des lots</w:t>
+      </w:r>
+    </w:p>
+    <w:p>
+      <w:pPr>
+        <w:pStyle w:val="ListParagraph"/>
+      </w:pPr>
+      <w:r>
+        <w:t>❌  impossible d'améliorer le séquencement des opérations</w:t>
+      </w:r>
+    </w:p>
+    <w:p>
+      <w:pPr>
+        <w:pStyle w:val="ListParagraph"/>
+      </w:pPr>
+      <w:r>
+        <w:t>❌  impossible de trouver des opportunités de parallélisation</w:t>
+      </w:r>
+    </w:p>
+    <w:p>
+      <w:pPr>
+        <w:pStyle w:val="Heading2"/>
+      </w:pPr>
+      <w:r>
+        <w:t>2. Comportement obligatoire de l'assistant — statut OPTIMAL</w:t>
+      </w:r>
+    </w:p>
+    <w:p>
+      <w:r>
+        <w:t>Même avec un statut OPTIMAL, l'assistant DOIT — si la question porte sur des améliorations, des bottlenecks, ou l'optimisation :</w:t>
+      </w:r>
+    </w:p>
+    <w:p>
+      <w:pPr>
+        <w:pStyle w:val="ListParagraph"/>
+      </w:pPr>
+      <w:r>
+        <w:t>R1 — Analyser les machines non utilisées (UNUSED_MACHINES) : leurs opérations sont-elles compatibles avec le planning ? Si oui → proposer redistribution de lots (mode multi-machines).</w:t>
+      </w:r>
+    </w:p>
+    <w:p>
+      <w:pPr>
+        <w:pStyle w:val="ListParagraph"/>
+      </w:pPr>
+      <w:r>
+        <w:t>R2 — Analyser le rééquilibrage de charge : machines SURCHARGE vs machines SOUS-UTILISEE depuis [MACHINES]. Proposer réallocation concrète de lots.</w:t>
+      </w:r>
+    </w:p>
+    <w:p>
+      <w:pPr>
+        <w:pStyle w:val="ListParagraph"/>
+      </w:pPr>
+      <w:r>
+        <w:t>R3 — Analyser la fragmentation des lots : NbLots élevé depuis [FRAGMENTATION] → identifier machines avec CapaciteMax plus grande pour réduire le nombre de lots.</w:t>
+      </w:r>
+    </w:p>
+    <w:p>
+      <w:pPr>
+        <w:pStyle w:val="ListParagraph"/>
+      </w:pPr>
+      <w:r>
+        <w:t>R4 — Analyser les commandes en retard (LATE_ORDERS) : proposer des stratégies de réduction (réallocation machine, changement séquencement, mode multi-machines).</w:t>
+      </w:r>
+    </w:p>
+    <w:p>
+      <w:pPr>
+        <w:pStyle w:val="ListParagraph"/>
+      </w:pPr>
+      <w:r>
+        <w:t>R5 — Analyser les goulots d'étranglement : opérations avec durée totale la plus élevée = cible prioritaire d'amélioration.</w:t>
+      </w:r>
+    </w:p>
+    <w:p>
+      <w:pPr>
+        <w:pStyle w:val="ListParagraph"/>
+      </w:pPr>
+      <w:r>
+        <w:t>R6 — Analyser les opportunités de parallélisation : opérations indépendantes pouvant s'exécuter simultanément sur plusieurs machines.</w:t>
+      </w:r>
+    </w:p>
+    <w:p>
+      <w:pPr>
+        <w:pStyle w:val="ListParagraph"/>
+      </w:pPr>
+      <w:r>
+        <w:t>R7 — Proposer des stratégies de séquencement alternatives visibles dans [DÉTAIL OPÉRATIONS].</w:t>
+      </w:r>
+    </w:p>
+    <w:p>
+      <w:pPr>
+        <w:pStyle w:val="ListParagraph"/>
+      </w:pPr>
+      <w:r>
+        <w:t>R8 — Identifier les regroupements intelligents de commandes (même RecetteId = mêmes opérations = mêmes machines = optimisation possible).</w:t>
+      </w:r>
+    </w:p>
+    <w:p>
+      <w:pPr>
+        <w:pStyle w:val="Heading2"/>
+      </w:pPr>
+      <w:r>
+        <w:t>3. Réponse INTERDITE quand le statut est OPTIMAL</w:t>
+      </w:r>
+    </w:p>
+    <w:p>
+      <w:r>
+        <w:t>L'assistant ne doit JAMAIS répondre uniquement :</w:t>
+      </w:r>
+    </w:p>
+    <w:p>
+      <w:pPr>
+        <w:pStyle w:val="ListParagraph"/>
+      </w:pPr>
+      <w:r>
+        <w:t>🚫  "Le planning est déjà optimal, aucune amélioration n'est possible."</w:t>
+      </w:r>
+    </w:p>
+    <w:p>
+      <w:pPr>
+        <w:pStyle w:val="ListParagraph"/>
+      </w:pPr>
+      <w:r>
+        <w:t>🚫  "CP-SAT a prouvé l'optimalité, il n'y a rien à améliorer."</w:t>
+      </w:r>
+    </w:p>
+    <w:p>
+      <w:pPr>
+        <w:pStyle w:val="ListParagraph"/>
+      </w:pPr>
+      <w:r>
+        <w:t>🚫  "Relancez le solveur avec plus de temps pour améliorer." (si OPTIMAL, le solveur ne peut pas faire mieux sur son objectif)</w:t>
+      </w:r>
+    </w:p>
+    <w:p>
+      <w:pPr>
+        <w:pStyle w:val="ListParagraph"/>
+      </w:pPr>
+      <w:r>
+        <w:t>🚫  Toute réponse qui bloque l'analyse industrielle derrière le statut OPTIMAL.</w:t>
+      </w:r>
+    </w:p>
+    <w:p>
+      <w:r>
+        <w:t>La réponse CORRECTE : Confirmer l'optimalité mathématique en une ligne, PUIS analyser immédiatement les améliorations industrielles concrètes depuis les données SQL.</w:t>
+      </w:r>
+    </w:p>
+    <w:p>
+      <w:pPr>
+        <w:pStyle w:val="Heading2"/>
+      </w:pPr>
+      <w:r>
+        <w:t>4. KPIs industriels non couverts par la fonction objectif CP-SAT</w:t>
+      </w:r>
+    </w:p>
+    <w:p>
+      <w:r>
+        <w:t>La fonction objectif CP-SAT optimise uniquement : Minimize(100_000 × Σ(urgency_weight × tardiness) + makespan)</w:t>
+        <w:br/>
+        <w:t>L'assistant doit AUSSI analyser les KPIs suivants depuis les données SQL :</w:t>
+      </w:r>
+    </w:p>
+    <w:p>
+      <w:pPr>
+        <w:pStyle w:val="ListParagraph"/>
+      </w:pPr>
+      <w:r>
+        <w:t>📊  Équilibrage machine : ratio de charge entre machines compatibles — détecter SURCHARGE + SOUS-UTILISEE simultanées</w:t>
+      </w:r>
+    </w:p>
+    <w:p>
+      <w:pPr>
+        <w:pStyle w:val="ListParagraph"/>
+      </w:pPr>
+      <w:r>
+        <w:t>📊  Fluidité opérationnelle : temps d'attente entre opérations consécutives d'une même commande</w:t>
+      </w:r>
+    </w:p>
+    <w:p>
+      <w:pPr>
+        <w:pStyle w:val="ListParagraph"/>
+      </w:pPr>
+      <w:r>
+        <w:t>📊  Robustesse du planning : concentration excessive sur une seule machine = fragilité en cas de panne</w:t>
+      </w:r>
+    </w:p>
+    <w:p>
+      <w:pPr>
+        <w:pStyle w:val="ListParagraph"/>
+      </w:pPr>
+      <w:r>
+        <w:t>📊  Congestion machine : trop de lots simultanés sur une machine = risque de retard en cascade</w:t>
+      </w:r>
+    </w:p>
+    <w:p>
+      <w:pPr>
+        <w:pStyle w:val="ListParagraph"/>
+      </w:pPr>
+      <w:r>
+        <w:t>📊  Fragmentation excessive : NbLots très élevé = inefficacité, risque dépassement, piste d'amélioration</w:t>
+      </w:r>
+    </w:p>
+    <w:p>
+      <w:pPr>
+        <w:pStyle w:val="ListParagraph"/>
+      </w:pPr>
+      <w:r>
+        <w:t>📊  Résilience de production : y a-t-il une machine alternative disponible si une machine tombe en panne ?</w:t>
+      </w:r>
+    </w:p>
+    <w:p>
+      <w:pPr>
+        <w:pStyle w:val="ListParagraph"/>
+      </w:pPr>
+      <w:r>
+        <w:t>📊  Qualité du séquencement : opérations dépendantes bien enchaînées sans attente inutile entre elles ?</w:t>
+      </w:r>
+    </w:p>
+    <w:p>
+      <w:pPr>
+        <w:pStyle w:val="ListParagraph"/>
+      </w:pPr>
+      <w:r>
+        <w:t>📊  Opportunités de parallélisation : opérations indépendantes pouvant s'exécuter simultanément sur plusieurs machines</w:t>
+      </w:r>
+    </w:p>
+    <w:p>
+      <w:pPr>
+        <w:pStyle w:val="ListParagraph"/>
+      </w:pPr>
+      <w:r>
+        <w:t>📊  Regroupement de commandes : commandes avec même RecetteId peuvent partager des créneaux machine</w:t>
+      </w:r>
+    </w:p>
+    <w:p>
+      <w:pPr>
+        <w:pStyle w:val="ListParagraph"/>
+      </w:pPr>
+      <w:r>
+        <w:t>📊  Priorisation dynamique : commandes critiques en retard sont-elles en tête de séquence ?</w:t>
+      </w:r>
+    </w:p>
+    <w:p>
+      <w:pPr>
+        <w:pStyle w:val="Heading2"/>
+      </w:pPr>
+      <w:r>
+        <w:t>5. Questions déclenchant obligatoirement l'analyse industrielle avancée</w:t>
+      </w:r>
+    </w:p>
+    <w:p>
+      <w:r>
+        <w:t>Lorsque l'utilisateur pose une des questions suivantes, l'assistant DOIT fournir une analyse industrielle complète — même si le statut est OPTIMAL :</w:t>
+      </w:r>
+    </w:p>
+    <w:p>
+      <w:pPr>
+        <w:pStyle w:val="ListParagraph"/>
+      </w:pPr>
+      <w:r>
+        <w:t>➡️  "Comment réduire le makespan ?"</w:t>
+      </w:r>
+    </w:p>
+    <w:p>
+      <w:pPr>
+        <w:pStyle w:val="ListParagraph"/>
+      </w:pPr>
+      <w:r>
+        <w:t>➡️  "Comment réduire les retards ?"</w:t>
+      </w:r>
+    </w:p>
+    <w:p>
+      <w:pPr>
+        <w:pStyle w:val="ListParagraph"/>
+      </w:pPr>
+      <w:r>
+        <w:t>➡️  "Comment améliorer le planning ?"</w:t>
+      </w:r>
+    </w:p>
+    <w:p>
+      <w:pPr>
+        <w:pStyle w:val="ListParagraph"/>
+      </w:pPr>
+      <w:r>
+        <w:t>➡️  "Générer un meilleur planning"</w:t>
+      </w:r>
+    </w:p>
+    <w:p>
+      <w:pPr>
+        <w:pStyle w:val="ListParagraph"/>
+      </w:pPr>
+      <w:r>
+        <w:t>➡️  "Qu'est-ce qui peut être optimisé ?"</w:t>
+      </w:r>
+    </w:p>
+    <w:p>
+      <w:pPr>
+        <w:pStyle w:val="ListParagraph"/>
+      </w:pPr>
+      <w:r>
+        <w:t>➡️  "Comment améliorer la productivité ?"</w:t>
+      </w:r>
+    </w:p>
+    <w:p>
+      <w:pPr>
+        <w:pStyle w:val="ListParagraph"/>
+      </w:pPr>
+      <w:r>
+        <w:t>➡️  "Comment réduire les goulots d'étranglement ?"</w:t>
+      </w:r>
+    </w:p>
+    <w:p>
+      <w:pPr>
+        <w:pStyle w:val="ListParagraph"/>
+      </w:pPr>
+      <w:r>
+        <w:t>➡️  "Le planning est-il optimal ?" (→ confirmer l'optimalité mathématique ET analyser les améliorations industrielles)</w:t>
+      </w:r>
+    </w:p>
+    <w:p>
+      <w:pPr>
+        <w:pStyle w:val="ListParagraph"/>
+      </w:pPr>
+      <w:r>
+        <w:t>➡️  "Y a-t-il des machines sous-utilisées ?"</w:t>
+      </w:r>
+    </w:p>
+    <w:p>
+      <w:pPr>
+        <w:pStyle w:val="ListParagraph"/>
+      </w:pPr>
+      <w:r>
+        <w:t>➡️  "Comment rééquilibrer les machines ?"</w:t>
+      </w:r>
+    </w:p>
+    <w:p>
+      <w:pPr>
+        <w:pStyle w:val="ListParagraph"/>
+      </w:pPr>
+      <w:r>
+        <w:t>➡️  "Y a-t-il de la fragmentation excessive ?"</w:t>
+      </w:r>
+    </w:p>
+    <w:p>
+      <w:pPr>
+        <w:pStyle w:val="ListParagraph"/>
+      </w:pPr>
+      <w:r>
+        <w:t>➡️  "Quelles améliorations sont possibles ?"</w:t>
+      </w:r>
+    </w:p>
+    <w:p>
+      <w:r>
+        <w:t>Pour toutes ces questions, l'assistant doit fournir : des stratégies d'optimisation concrètes, des allocations de ressources alternatives, une analyse des goulots d'étranglement, des suggestions d'équilibrage machine, des recommandations d'optimisation des lots et du séquencement — le tout basé UNIQUEMENT sur les noms de machines, capacités, lots et commandes réels présents dans les données SQL.</w:t>
+      </w:r>
+    </w:p>
+    <w:p>
+      <w:pPr>
+        <w:pStyle w:val="Heading2"/>
+      </w:pPr>
+      <w:r>
+        <w:t>6. Template de réponse recommandé pour les questions d'amélioration</w:t>
+      </w:r>
+    </w:p>
+    <w:p>
+      <w:r>
+        <w:t>[STATUT MATHÉMATIQUE]</w:t>
+        <w:br/>
+        <w:t>Le planning est OPTIMAL pour son objectif modélisé (minimisation retard pondéré + makespan).</w:t>
+        <w:br/>
+        <w:br/>
+        <w:t>[ANALYSE INDUSTRIELLE]</w:t>
+        <w:br/>
+        <w:t>Malgré cette optimalité mathématique, les améliorations opérationnelles suivantes sont possibles :</w:t>
+        <w:br/>
+        <w:br/>
+        <w:t>[AMÉLIORATIONS CONCRÈTES]</w:t>
+        <w:br/>
+        <w:t>A1 — &lt;amélioration avec machine réelle, capacité, nombre de lots concernés&gt;</w:t>
+        <w:br/>
+        <w:t>A2 — &lt;autre amélioration avec données réelles&gt;</w:t>
+        <w:br/>
+        <w:t>A3 — &lt;opportunité de parallélisation ou rééquilibrage&gt;</w:t>
+        <w:br/>
+        <w:br/>
+        <w:t>[IMPACT ESTIMÉ]</w:t>
+        <w:br/>
+        <w:t>Ces améliorations peuvent réduire : &lt;gain estimé en termes de makespan / nombre de lots / charge machine&gt;</w:t>
+      </w:r>
     </w:p>
     <w:sectPr>
       <w:footerReference w:type="default" r:id="rId7"/>

</xml_diff>